<commit_message>
Match Word typography to the PDF
The DOCX carried the same words as the PDF but looked like a different
document: pandoc's reference defaults are 12 pt, left-aligned, and use a
theme font that Word resolves to Calibri, against the PDF's 10.5 pt
justified serif. Side by side the Word copy reads as an older draft even
though the content is identical.

Set the docDefaults run font to Georgia at 10.5 pt and justified body
paragraphs, so both formats render as the same document.

Two things worth noting for anyone editing reference.docx later: the
default font is theme-based (minorHAnsi) rather than a literal name, so
it has to be replaced as an element rather than a string, and the
self-closing tags carry a space before '/>', which defeats an exact
string match.
</commit_message>
<xml_diff>
--- a/assignment3/report/reference.docx
+++ b/assignment3/report/reference.docx
@@ -485,14 +485,15 @@
   <w:docDefaults>
     <w:rPrDefault>
       <w:rPr>
-        <w:rFonts w:asciiTheme="minorHAnsi" w:eastAsiaTheme="minorEastAsia" w:hAnsiTheme="minorHAnsi" w:cstheme="minorBidi"/>
-        <w:sz w:val="24"/>
-        <w:szCs w:val="24"/>
+        <w:rFonts w:ascii="Georgia" w:hAnsi="Georgia" w:eastAsia="Georgia" w:cs="Georgia"/>
+        <w:sz w:val="21"/>
+        <w:szCs w:val="21"/>
         <w:lang w:val="en-US" w:eastAsia="zh-CN" w:bidi="ar-SA"/>
       </w:rPr>
     </w:rPrDefault>
     <w:pPrDefault>
       <w:pPr>
+        <w:jc w:val="both"/>
         <w:spacing w:after="200"/>
       </w:pPr>
     </w:pPrDefault>

</xml_diff>